<commit_message>
feat: ATIVIDADE-EXCEL.docx adiciona instrucao de renomear arquivo com nomes dos alunos
</commit_message>
<xml_diff>
--- a/sistema/INTRODUCAO_A_TECNOLOGIA_DA_INFORMACAO_E_COMUNICACAO/AULAS/AULA-07-11-08-2026/ATIVIDADE-EXCEL.docx
+++ b/sistema/INTRODUCAO_A_TECNOLOGIA_DA_INFORMACAO_E_COMUNICACAO/AULAS/AULA-07-11-08-2026/ATIVIDADE-EXCEL.docx
@@ -117,6 +117,165 @@
                 <w:szCs w:val="16"/>
               </w:rPr>
               <w:t xml:space="preserve">Aula 07  |  11/08/2026  |  Trabalho em dupla  |  Duração: 1 hora</w:t>
+            </w:r>
+          </w:p>
+        </w:tc>
+      </w:tr>
+    </w:tbl>
+    <w:p>
+      <w:pPr>
+        <w:spacing w:after="0" w:before="100"/>
+      </w:pPr>
+    </w:p>
+    <w:tbl>
+      <w:tblPr>
+        <w:tblW w:type="dxa" w:w="9360"/>
+        <w:tblBorders>
+          <w:top w:val="single" w:color="auto" w:sz="4"/>
+          <w:left w:val="single" w:color="auto" w:sz="4"/>
+          <w:bottom w:val="single" w:color="auto" w:sz="4"/>
+          <w:right w:val="single" w:color="auto" w:sz="4"/>
+          <w:insideH w:val="single" w:color="auto" w:sz="4"/>
+          <w:insideV w:val="single" w:color="auto" w:sz="4"/>
+        </w:tblBorders>
+      </w:tblPr>
+      <w:tblGrid>
+        <w:gridCol w:w="9360"/>
+      </w:tblGrid>
+      <w:tr>
+        <w:tc>
+          <w:tcPr>
+            <w:tcW w:type="dxa" w:w="9360"/>
+            <w:tcBorders>
+              <w:top w:val="single" w:color="F9A825" w:sz="8"/>
+              <w:left w:val="single" w:color="F9A825" w:sz="8"/>
+              <w:bottom w:val="single" w:color="F9A825" w:sz="8"/>
+              <w:right w:val="single" w:color="F9A825" w:sz="8"/>
+            </w:tcBorders>
+            <w:shd w:fill="FFF9C4" w:val="clear"/>
+            <w:tcMar>
+              <w:top w:type="dxa" w:w="100"/>
+              <w:left w:type="dxa" w:w="180"/>
+              <w:bottom w:type="dxa" w:w="100"/>
+              <w:right w:type="dxa" w:w="180"/>
+            </w:tcMar>
+          </w:tcPr>
+          <w:p>
+            <w:pPr>
+              <w:jc w:val="center"/>
+            </w:pPr>
+            <w:r>
+              <w:rPr>
+                <w:rFonts w:ascii="Calibri" w:cs="Calibri" w:eastAsia="Calibri" w:hAnsi="Calibri"/>
+                <w:b/>
+                <w:bCs/>
+                <w:color w:val="E65100"/>
+                <w:sz w:val="22"/>
+                <w:szCs w:val="22"/>
+              </w:rPr>
+              <w:t xml:space="preserve">⚠️  ATENÇÃO — NOME DO ARQUIVO</w:t>
+            </w:r>
+          </w:p>
+          <w:p>
+            <w:pPr>
+              <w:spacing w:before="60"/>
+              <w:jc w:val="center"/>
+            </w:pPr>
+            <w:r>
+              <w:rPr>
+                <w:rFonts w:ascii="Calibri" w:cs="Calibri" w:eastAsia="Calibri" w:hAnsi="Calibri"/>
+                <w:color w:val="333333"/>
+                <w:sz w:val="20"/>
+                <w:szCs w:val="20"/>
+              </w:rPr>
+              <w:t xml:space="preserve">Ao salvar, renomeie este arquivo com o nome dos dois alunos da dupla:</w:t>
+            </w:r>
+          </w:p>
+          <w:p>
+            <w:pPr>
+              <w:spacing w:before="60"/>
+              <w:jc w:val="center"/>
+            </w:pPr>
+            <w:r>
+              <w:rPr>
+                <w:rFonts w:ascii="Calibri" w:cs="Calibri" w:eastAsia="Calibri" w:hAnsi="Calibri"/>
+                <w:b/>
+                <w:bCs/>
+                <w:color w:val="004384"/>
+                <w:sz w:val="24"/>
+                <w:szCs w:val="24"/>
+              </w:rPr>
+              <w:t xml:space="preserve">ATIVIDADE-EXCEL-</w:t>
+            </w:r>
+            <w:r>
+              <w:rPr>
+                <w:rFonts w:ascii="Calibri" w:cs="Calibri" w:eastAsia="Calibri" w:hAnsi="Calibri"/>
+                <w:b/>
+                <w:bCs/>
+                <w:color w:val="F7941D"/>
+                <w:sz w:val="24"/>
+                <w:szCs w:val="24"/>
+              </w:rPr>
+              <w:t xml:space="preserve">NOME-ALUNO-01</w:t>
+            </w:r>
+            <w:r>
+              <w:rPr>
+                <w:rFonts w:ascii="Calibri" w:cs="Calibri" w:eastAsia="Calibri" w:hAnsi="Calibri"/>
+                <w:b/>
+                <w:bCs/>
+                <w:color w:val="004384"/>
+                <w:sz w:val="24"/>
+                <w:szCs w:val="24"/>
+              </w:rPr>
+              <w:t xml:space="preserve">-</w:t>
+            </w:r>
+            <w:r>
+              <w:rPr>
+                <w:rFonts w:ascii="Calibri" w:cs="Calibri" w:eastAsia="Calibri" w:hAnsi="Calibri"/>
+                <w:b/>
+                <w:bCs/>
+                <w:color w:val="F7941D"/>
+                <w:sz w:val="24"/>
+                <w:szCs w:val="24"/>
+              </w:rPr>
+              <w:t xml:space="preserve">NOME-ALUNO-02</w:t>
+            </w:r>
+            <w:r>
+              <w:rPr>
+                <w:rFonts w:ascii="Calibri" w:cs="Calibri" w:eastAsia="Calibri" w:hAnsi="Calibri"/>
+                <w:b/>
+                <w:bCs/>
+                <w:color w:val="004384"/>
+                <w:sz w:val="24"/>
+                <w:szCs w:val="24"/>
+              </w:rPr>
+              <w:t xml:space="preserve">.docx</w:t>
+            </w:r>
+          </w:p>
+          <w:p>
+            <w:pPr>
+              <w:spacing w:before="60"/>
+              <w:jc w:val="center"/>
+            </w:pPr>
+            <w:r>
+              <w:rPr>
+                <w:rFonts w:ascii="Calibri" w:cs="Calibri" w:eastAsia="Calibri" w:hAnsi="Calibri"/>
+                <w:color w:val="666666"/>
+                <w:sz w:val="18"/>
+                <w:szCs w:val="18"/>
+              </w:rPr>
+              <w:t xml:space="preserve">Exemplo: </w:t>
+            </w:r>
+            <w:r>
+              <w:rPr>
+                <w:rFonts w:ascii="Calibri" w:cs="Calibri" w:eastAsia="Calibri" w:hAnsi="Calibri"/>
+                <w:i/>
+                <w:iCs/>
+                <w:color w:val="555555"/>
+                <w:sz w:val="18"/>
+                <w:szCs w:val="18"/>
+              </w:rPr>
+              <w:t xml:space="preserve">ATIVIDADE-EXCEL-JOAO-SILVA-MARIA-SOUZA.docx</w:t>
             </w:r>
           </w:p>
         </w:tc>

</xml_diff>